<commit_message>
limpieza final, version oficial EP2 y actualizacion de README
</commit_message>
<xml_diff>
--- a/documentacion/captura/09_Plantilla_Documento_Cobertura_Testing_EP2 (1).docx
+++ b/documentacion/captura/09_Plantilla_Documento_Cobertura_Testing_EP2 (1).docx
@@ -3765,7 +3765,25 @@
         <w:rPr>
           <w:lang w:val="es-CL" w:eastAsia="es-CL" w:bidi="es-CL"/>
         </w:rPr>
-        <w:t xml:space="preserve">. Al alcanzar una cobertura del 100% en líneas y funciones, se logró garantizar que la lógica de negocio (CRUD) y el renderizado de los componentes críticos de Veterinaria San Marcos operan de manera robusta, previniendo regresiones. Este nivel de cobertura nos deja una base sólida y altamente confiable en la interfaz de </w:t>
+        <w:t>. Al alcanzar un</w:t>
+      </w:r>
+      <w:r>
+        <w:rPr>
+          <w:lang w:val="es-CL" w:eastAsia="es-CL" w:bidi="es-CL"/>
+        </w:rPr>
+        <w:t xml:space="preserve"> </w:t>
+      </w:r>
+      <w:r>
+        <w:rPr>
+          <w:lang w:val="es-CL" w:eastAsia="es-CL" w:bidi="es-CL"/>
+        </w:rPr>
+        <w:t>60.8% de cobertura global con 82 pruebas unitarias exitosas</w:t>
+      </w:r>
+      <w:r>
+        <w:rPr>
+          <w:lang w:val="es-CL" w:eastAsia="es-CL" w:bidi="es-CL"/>
+        </w:rPr>
+        <w:t xml:space="preserve">, se logró garantizar que la lógica de negocio (CRUD) y el renderizado de los componentes críticos de Veterinaria San Marcos operan de manera robusta, previniendo regresiones. Este nivel de cobertura nos deja una base sólida y altamente confiable en la interfaz de </w:t>
       </w:r>
       <w:proofErr w:type="spellStart"/>
       <w:r>

</xml_diff>